<commit_message>
making sure everything works/is translated correctly
</commit_message>
<xml_diff>
--- a/docs/Information_Sheet_Informational_Comparisons_Spanish.docx
+++ b/docs/Information_Sheet_Informational_Comparisons_Spanish.docx
@@ -131,19 +131,19 @@
         <w:rPr>
           <w:rFonts w:ascii="Arial" w:hAnsi="Arial" w:cs="Arial"/>
         </w:rPr>
-        <w:t xml:space="preserve"> La información específica que reciba se le asignará aleatoriamente. Ambas encuestas incluyen preguntas de </w:t>
-      </w:r>
-      <w:r>
-        <w:rPr>
-          <w:rFonts w:ascii="Arial" w:hAnsi="Arial" w:cs="Arial"/>
-        </w:rPr>
-        <w:t xml:space="preserve">para evaluar su </w:t>
-      </w:r>
-      <w:r>
-        <w:rPr>
-          <w:rFonts w:ascii="Arial" w:hAnsi="Arial" w:cs="Arial"/>
-        </w:rPr>
-        <w:t xml:space="preserve">atención para garantizar la calidad de los datos; si no responde correctamente a una pregunta de </w:t>
+        <w:t xml:space="preserve"> La información específica que reciba se le asignará aleatoriamente. </w:t>
+      </w:r>
+      <w:r>
+        <w:rPr>
+          <w:rFonts w:ascii="Arial" w:hAnsi="Arial" w:cs="Arial"/>
+        </w:rPr>
+        <w:t>Ambas encuestas incluyen preguntas que evaluarán su atención para garantizar</w:t>
+      </w:r>
+      <w:r>
+        <w:rPr>
+          <w:rFonts w:ascii="Arial" w:hAnsi="Arial" w:cs="Arial"/>
+        </w:rPr>
+        <w:t xml:space="preserve"> la calidad de los datos; si no responde correctamente a una pregunta de </w:t>
       </w:r>
       <w:r>
         <w:rPr>
@@ -196,13 +196,55 @@
         <w:rPr>
           <w:rFonts w:ascii="Arial" w:hAnsi="Arial" w:cs="Arial"/>
         </w:rPr>
-        <w:t xml:space="preserve">A cambio de tu participación, Netquest te recompensará con Korus (Puntos) que podrás canjear por premios. La cantidad de Korus (Puntos) que ganarás por estas actividades variará según diversos factores establecidos por </w:t>
-      </w:r>
-      <w:r>
-        <w:rPr>
-          <w:rFonts w:ascii="Arial" w:hAnsi="Arial" w:cs="Arial"/>
-        </w:rPr>
-        <w:t>Netquest . Participar en este estudio es gratuito.</w:t>
+        <w:t xml:space="preserve">A cambio de </w:t>
+      </w:r>
+      <w:r>
+        <w:rPr>
+          <w:rFonts w:ascii="Arial" w:hAnsi="Arial" w:cs="Arial"/>
+        </w:rPr>
+        <w:t>su</w:t>
+      </w:r>
+      <w:r>
+        <w:rPr>
+          <w:rFonts w:ascii="Arial" w:hAnsi="Arial" w:cs="Arial"/>
+        </w:rPr>
+        <w:t xml:space="preserve"> participación, </w:t>
+      </w:r>
+      <w:proofErr w:type="spellStart"/>
+      <w:r>
+        <w:rPr>
+          <w:rFonts w:ascii="Arial" w:hAnsi="Arial" w:cs="Arial"/>
+        </w:rPr>
+        <w:t>Netquest</w:t>
+      </w:r>
+      <w:proofErr w:type="spellEnd"/>
+      <w:r>
+        <w:rPr>
+          <w:rFonts w:ascii="Arial" w:hAnsi="Arial" w:cs="Arial"/>
+        </w:rPr>
+        <w:t xml:space="preserve"> te recompensará con Korus (Puntos) que podrás canjear por premios. La cantidad de Korus (Puntos) que ganarás por estas actividades variará según diversos factores establecidos por </w:t>
+      </w:r>
+      <w:proofErr w:type="spellStart"/>
+      <w:proofErr w:type="gramStart"/>
+      <w:r>
+        <w:rPr>
+          <w:rFonts w:ascii="Arial" w:hAnsi="Arial" w:cs="Arial"/>
+        </w:rPr>
+        <w:t>Netquest</w:t>
+      </w:r>
+      <w:proofErr w:type="spellEnd"/>
+      <w:r>
+        <w:rPr>
+          <w:rFonts w:ascii="Arial" w:hAnsi="Arial" w:cs="Arial"/>
+        </w:rPr>
+        <w:t xml:space="preserve"> .</w:t>
+      </w:r>
+      <w:proofErr w:type="gramEnd"/>
+      <w:r>
+        <w:rPr>
+          <w:rFonts w:ascii="Arial" w:hAnsi="Arial" w:cs="Arial"/>
+        </w:rPr>
+        <w:t xml:space="preserve"> Participar en este estudio es gratuito.</w:t>
       </w:r>
     </w:p>
     <w:p>
@@ -290,7 +332,21 @@
         <w:rPr>
           <w:rFonts w:ascii="Arial" w:hAnsi="Arial" w:cs="Arial"/>
         </w:rPr>
-        <w:t xml:space="preserve">Para obtener más información o si tiene preguntas sobre esta investigación, puede comunicarse con Adam Roberts a través de arober48@ur.rochester.edu. Comuníquese con la Junta de Revisión de Sujetos de Investigación de la Universidad de Rochester en 265 Crittenden Blvd., CU 420628, Rochester, NY 14642, teléfono +001 (585) 273-4127 o +001 (877) 449-4441. Para comunicarse con la Oficina de Protección de Sujetos Humanos, utilice el </w:t>
+        <w:t xml:space="preserve">Para obtener más información o si tiene preguntas sobre esta investigación, puede comunicarse con Adam Roberts a través de arober48@ur.rochester.edu. Comuníquese con la Junta de Revisión de Sujetos de Investigación de la Universidad de Rochester en 265 Crittenden </w:t>
+      </w:r>
+      <w:proofErr w:type="spellStart"/>
+      <w:r>
+        <w:rPr>
+          <w:rFonts w:ascii="Arial" w:hAnsi="Arial" w:cs="Arial"/>
+        </w:rPr>
+        <w:t>Blvd</w:t>
+      </w:r>
+      <w:proofErr w:type="spellEnd"/>
+      <w:r>
+        <w:rPr>
+          <w:rFonts w:ascii="Arial" w:hAnsi="Arial" w:cs="Arial"/>
+        </w:rPr>
+        <w:t xml:space="preserve">., CU 420628, Rochester, NY 14642, teléfono +001 (585) 273-4127 o +001 (877) 449-4441. Para comunicarse con la Oficina de Protección de Sujetos Humanos, utilice el </w:t>
       </w:r>
       <w:hyperlink r:id="rId7" w:history="1">
         <w:r>
@@ -317,13 +373,69 @@
         </w:numPr>
         <w:rPr>
           <w:rFonts w:ascii="Arial" w:hAnsi="Arial" w:cs="Arial"/>
-        </w:rPr>
-      </w:pPr>
-      <w:r>
-        <w:rPr>
-          <w:rFonts w:ascii="Arial" w:hAnsi="Arial" w:cs="Arial"/>
-        </w:rPr>
-        <w:t>Usted desea hablar con alguien que no sea el personal de investigación sobre sus derechos como investigador. sujeto;</w:t>
+          <w:lang w:val="en-US"/>
+        </w:rPr>
+      </w:pPr>
+      <w:r>
+        <w:rPr>
+          <w:rFonts w:ascii="Arial" w:hAnsi="Arial" w:cs="Arial"/>
+        </w:rPr>
+        <w:t xml:space="preserve">Usted desea hablar con alguien que no sea el personal de investigación sobre </w:t>
+      </w:r>
+      <w:r>
+        <w:rPr>
+          <w:rFonts w:ascii="Arial" w:hAnsi="Arial" w:cs="Arial"/>
+          <w:lang w:val="en-US"/>
+        </w:rPr>
+        <w:t xml:space="preserve">sus derechos </w:t>
+      </w:r>
+      <w:proofErr w:type="spellStart"/>
+      <w:r>
+        <w:rPr>
+          <w:rFonts w:ascii="Arial" w:hAnsi="Arial" w:cs="Arial"/>
+          <w:lang w:val="en-US"/>
+        </w:rPr>
+        <w:t>como</w:t>
+      </w:r>
+      <w:proofErr w:type="spellEnd"/>
+      <w:r>
+        <w:rPr>
+          <w:rFonts w:ascii="Arial" w:hAnsi="Arial" w:cs="Arial"/>
+          <w:lang w:val="en-US"/>
+        </w:rPr>
+        <w:t xml:space="preserve"> </w:t>
+      </w:r>
+      <w:proofErr w:type="spellStart"/>
+      <w:r>
+        <w:rPr>
+          <w:rFonts w:ascii="Arial" w:hAnsi="Arial" w:cs="Arial"/>
+          <w:lang w:val="en-US"/>
+        </w:rPr>
+        <w:t>sujeto</w:t>
+      </w:r>
+      <w:proofErr w:type="spellEnd"/>
+      <w:r>
+        <w:rPr>
+          <w:rFonts w:ascii="Arial" w:hAnsi="Arial" w:cs="Arial"/>
+          <w:lang w:val="en-US"/>
+        </w:rPr>
+        <w:t xml:space="preserve"> de </w:t>
+      </w:r>
+      <w:proofErr w:type="spellStart"/>
+      <w:r>
+        <w:rPr>
+          <w:rFonts w:ascii="Arial" w:hAnsi="Arial" w:cs="Arial"/>
+          <w:lang w:val="en-US"/>
+        </w:rPr>
+        <w:t>investigación</w:t>
+      </w:r>
+      <w:proofErr w:type="spellEnd"/>
+      <w:r>
+        <w:rPr>
+          <w:rFonts w:ascii="Arial" w:hAnsi="Arial" w:cs="Arial"/>
+          <w:lang w:val="en-US"/>
+        </w:rPr>
+        <w:t>;</w:t>
       </w:r>
     </w:p>
     <w:p>
@@ -1979,7 +2091,6 @@
   <w:style w:type="character" w:default="1" w:styleId="DefaultParagraphFont">
     <w:name w:val="Default Paragraph Font"/>
     <w:uiPriority w:val="1"/>
-    <w:semiHidden/>
     <w:unhideWhenUsed/>
   </w:style>
   <w:style w:type="table" w:default="1" w:styleId="TableNormal">

</xml_diff>